<commit_message>
Update phone number to (920) 572-8646 in downloadable documents
- Rate sheet, one-page summary, and pardon overview (PDF and Word) plus the PDF pack

Co-Authored-By: Claude Opus 5.5 <noreply@anthropic.com>
Claude-Session: https://claude.ai/code/session_01K1o6sCTjAJTvF6RYPzxMUF
</commit_message>
<xml_diff>
--- a/docs/Paper_Chasers_LLC_Clemency_Marketing_Sheet.docx
+++ b/docs/Paper_Chasers_LLC_Clemency_Marketing_Sheet.docx
@@ -110,7 +110,7 @@
         <w:t xml:space="preserve">(920) </w:t>
       </w:r>
       <w:r>
-        <w:t>400-5908</w:t>
+        <w:t>572-8646</w:t>
       </w:r>
     </w:p>
     <w:p>
@@ -390,7 +390,7 @@
         <w:pStyle w:val="NoSpacing"/>
       </w:pPr>
       <w:r>
-        <w:t>Phone/Text: (920) 400-5908</w:t>
+        <w:t>Phone/Text: (920) 572-8646</w:t>
       </w:r>
     </w:p>
     <w:p>

</xml_diff>

<commit_message>
Align downloadable documents with current policies
- Pardon Advisory Board (not 'Clemency Advisory Board')
- 4% card processing fee
- 'Form typing from client-provided information' instead of form completion
- Appleton address in the Word copies; PDF pack rebuilt

Co-Authored-By: Claude Opus 5.5 <noreply@anthropic.com>
Claude-Session: https://claude.ai/code/session_01K1o6sCTjAJTvF6RYPzxMUF
</commit_message>
<xml_diff>
--- a/docs/Paper_Chasers_LLC_Clemency_Marketing_Sheet.docx
+++ b/docs/Paper_Chasers_LLC_Clemency_Marketing_Sheet.docx
@@ -94,11 +94,11 @@
         <w:jc w:val="center"/>
       </w:pPr>
       <w:r>
-        <w:t>1020 Oviatt Street, Suite #5</w:t>
+        <w:t xml:space="preserve">2418 West Charles Street</w:t>
       </w:r>
       <w:r>
         <w:br/>
-        <w:t>Kaukauna, Wisconsin 54130</w:t>
+        <w:t xml:space="preserve">Appleton, Wisconsin 54914</w:t>
       </w:r>
     </w:p>
     <w:p>
@@ -369,7 +369,7 @@
         <w:pStyle w:val="NoSpacing"/>
       </w:pPr>
       <w:r>
-        <w:t>Paper Chasers LLC provides document preparation and narrative drafting assistance only. We do not provide legal advice, guarantee outcomes, or represent clients before the Wisconsin Clemency Advisory Board. Clients remain fully responsible for the content and submission of their application.</w:t>
+        <w:t xml:space="preserve">Paper Chasers LLC provides document preparation and narrative drafting assistance only. We do not provide legal advice, guarantee outcomes, or represent clients before the Wisconsin Pardon Advisory Board. Clients remain fully responsible for the content and submission of their application.</w:t>
       </w:r>
     </w:p>
     <w:p>

</xml_diff>

<commit_message>
Use the new PC logo in the Word letterheads under docs/
Co-Authored-By: Claude Opus 5.5 <noreply@anthropic.com>
Claude-Session: https://claude.ai/code/session_01K1o6sCTjAJTvF6RYPzxMUF
</commit_message>
<xml_diff>
--- a/docs/Paper_Chasers_LLC_Clemency_Marketing_Sheet.docx
+++ b/docs/Paper_Chasers_LLC_Clemency_Marketing_Sheet.docx
@@ -14,12 +14,12 @@
           <wp:anchor distT="0" distB="0" distL="114300" distR="114300" simplePos="0" relativeHeight="251657216" behindDoc="1" locked="0" layoutInCell="1" allowOverlap="1" wp14:anchorId="4410EBD3" wp14:editId="5833E8E0">
             <wp:simplePos x="0" y="0"/>
             <wp:positionH relativeFrom="margin">
-              <wp:align>right</wp:align>
+              <wp:align>center</wp:align>
             </wp:positionH>
             <wp:positionV relativeFrom="paragraph">
               <wp:posOffset>-609600</wp:posOffset>
             </wp:positionV>
-            <wp:extent cx="5629275" cy="1609725"/>
+            <wp:extent cx="1716340" cy="1287780"/>
             <wp:effectExtent l="0" t="0" r="0" b="0"/>
             <wp:wrapNone/>
             <wp:docPr id="1758700588" name="Picture 1"/>
@@ -35,7 +35,6 @@
                   </pic:nvPicPr>
                   <pic:blipFill rotWithShape="1">
                     <a:blip r:embed="rId6"/>
-                    <a:srcRect l="8477" t="31173" r="10711" b="34159"/>
                     <a:stretch>
                       <a:fillRect/>
                     </a:stretch>
@@ -43,7 +42,7 @@
                   <pic:spPr bwMode="auto">
                     <a:xfrm>
                       <a:off x="0" y="0"/>
-                      <a:ext cx="5629275" cy="1609725"/>
+                      <a:ext cx="1716340" cy="1287780"/>
                     </a:xfrm>
                     <a:prstGeom prst="rect">
                       <a:avLst/>

</xml_diff>